<commit_message>
fix(pdf2rtf): eliminate Word COM formatting bleed in holdout generation and audit line spacing
</commit_message>
<xml_diff>
--- a/experimental/pdf2rtf/real_word_holdout/word_academic_paper.docx
+++ b/experimental/pdf2rtf/real_word_holdout/word_academic_paper.docx
@@ -27,7 +27,6 @@
         <w:jc w:val="center"/>
         <w:rPr>
           <w:rFonts w:ascii="Calibri" w:hAnsi="Calibri" w:cs="Calibri"/>
-          <w:b/>
           <w:i/>
           <w:sz w:val="22"/>
         </w:rPr>
@@ -35,7 +34,6 @@
       <w:r>
         <w:rPr>
           <w:rFonts w:ascii="Calibri" w:hAnsi="Calibri" w:cs="Calibri"/>
-          <w:b/>
           <w:i/>
           <w:sz w:val="22"/>
         </w:rPr>
@@ -48,7 +46,6 @@
         <w:rPr>
           <w:rFonts w:ascii="Arial" w:hAnsi="Arial" w:cs="Arial"/>
           <w:b/>
-          <w:i/>
           <w:sz w:val="26"/>
         </w:rPr>
       </w:pPr>
@@ -56,7 +53,6 @@
         <w:rPr>
           <w:rFonts w:ascii="Arial" w:hAnsi="Arial" w:cs="Arial"/>
           <w:b/>
-          <w:i/>
           <w:sz w:val="26"/>
         </w:rPr>
         <w:t>1. Introduction and Architectural Primitives</w:t>
@@ -67,16 +63,12 @@
         <w:spacing w:before="240" w:after="120"/>
         <w:rPr>
           <w:rFonts w:ascii="Calibri" w:hAnsi="Calibri" w:cs="Calibri"/>
-          <w:b/>
-          <w:i/>
           <w:sz w:val="22"/>
         </w:rPr>
       </w:pPr>
       <w:r>
         <w:rPr>
           <w:rFonts w:ascii="Calibri" w:hAnsi="Calibri" w:cs="Calibri"/>
-          <w:b/>
-          <w:i/>
           <w:sz w:val="22"/>
         </w:rPr>
         <w:t>Autonomous evolutionary optimization operates by generating bounded hypotheses and verifying them against strict equivalence oracles.</w:t>
@@ -87,16 +79,12 @@
         <w:spacing w:before="240" w:after="80"/>
         <w:rPr>
           <w:rFonts w:ascii="Calibri" w:hAnsi="Calibri" w:cs="Calibri"/>
-          <w:b/>
-          <w:i/>
           <w:sz w:val="22"/>
         </w:rPr>
       </w:pPr>
       <w:r>
         <w:rPr>
           <w:rFonts w:ascii="Calibri" w:hAnsi="Calibri" w:cs="Calibri"/>
-          <w:b/>
-          <w:i/>
           <w:sz w:val="22"/>
         </w:rPr>
         <w:t>- Invariant core representation of canonical document trees.</w:t>
@@ -107,16 +95,12 @@
         <w:spacing w:before="240" w:after="80"/>
         <w:rPr>
           <w:rFonts w:ascii="Calibri" w:hAnsi="Calibri" w:cs="Calibri"/>
-          <w:b/>
-          <w:i/>
           <w:sz w:val="22"/>
         </w:rPr>
       </w:pPr>
       <w:r>
         <w:rPr>
           <w:rFonts w:ascii="Calibri" w:hAnsi="Calibri" w:cs="Calibri"/>
-          <w:b/>
-          <w:i/>
           <w:sz w:val="22"/>
         </w:rPr>
         <w:t>- Multi-gate verification with cascading integrity penalties.</w:t>
@@ -127,16 +111,12 @@
         <w:spacing w:before="240" w:after="240"/>
         <w:rPr>
           <w:rFonts w:ascii="Calibri" w:hAnsi="Calibri" w:cs="Calibri"/>
-          <w:b/>
-          <w:i/>
           <w:sz w:val="22"/>
         </w:rPr>
       </w:pPr>
       <w:r>
         <w:rPr>
           <w:rFonts w:ascii="Calibri" w:hAnsi="Calibri" w:cs="Calibri"/>
-          <w:b/>
-          <w:i/>
           <w:sz w:val="22"/>
         </w:rPr>
         <w:t>- Empirical calibration against real Word document layouts.</w:t>
@@ -147,8 +127,6 @@
         <w:spacing w:before="240" w:after="240"/>
         <w:rPr>
           <w:rFonts w:ascii="Calibri" w:hAnsi="Calibri" w:cs="Calibri"/>
-          <w:b/>
-          <w:i/>
           <w:sz w:val="22"/>
         </w:rPr>
       </w:pPr>
@@ -569,7 +547,7 @@
     <w:link w:val="1Char"/>
     <w:uiPriority w:val="9"/>
     <w:qFormat/>
-    <w:rsid w:val="008312A7"/>
+    <w:rsid w:val="0073583D"/>
     <w:pPr>
       <w:keepNext/>
       <w:keepLines/>
@@ -592,7 +570,7 @@
     <w:semiHidden/>
     <w:unhideWhenUsed/>
     <w:qFormat/>
-    <w:rsid w:val="008312A7"/>
+    <w:rsid w:val="0073583D"/>
     <w:pPr>
       <w:keepNext/>
       <w:keepLines/>
@@ -615,7 +593,7 @@
     <w:semiHidden/>
     <w:unhideWhenUsed/>
     <w:qFormat/>
-    <w:rsid w:val="008312A7"/>
+    <w:rsid w:val="0073583D"/>
     <w:pPr>
       <w:keepNext/>
       <w:keepLines/>
@@ -636,7 +614,7 @@
     <w:semiHidden/>
     <w:unhideWhenUsed/>
     <w:qFormat/>
-    <w:rsid w:val="008312A7"/>
+    <w:rsid w:val="0073583D"/>
     <w:pPr>
       <w:keepNext/>
       <w:keepLines/>
@@ -659,7 +637,7 @@
     <w:semiHidden/>
     <w:unhideWhenUsed/>
     <w:qFormat/>
-    <w:rsid w:val="008312A7"/>
+    <w:rsid w:val="0073583D"/>
     <w:pPr>
       <w:keepNext/>
       <w:keepLines/>
@@ -680,7 +658,7 @@
     <w:semiHidden/>
     <w:unhideWhenUsed/>
     <w:qFormat/>
-    <w:rsid w:val="008312A7"/>
+    <w:rsid w:val="0073583D"/>
     <w:pPr>
       <w:keepNext/>
       <w:keepLines/>
@@ -703,7 +681,7 @@
     <w:semiHidden/>
     <w:unhideWhenUsed/>
     <w:qFormat/>
-    <w:rsid w:val="008312A7"/>
+    <w:rsid w:val="0073583D"/>
     <w:pPr>
       <w:keepNext/>
       <w:keepLines/>
@@ -724,7 +702,7 @@
     <w:semiHidden/>
     <w:unhideWhenUsed/>
     <w:qFormat/>
-    <w:rsid w:val="008312A7"/>
+    <w:rsid w:val="0073583D"/>
     <w:pPr>
       <w:keepNext/>
       <w:keepLines/>
@@ -747,7 +725,7 @@
     <w:semiHidden/>
     <w:unhideWhenUsed/>
     <w:qFormat/>
-    <w:rsid w:val="008312A7"/>
+    <w:rsid w:val="0073583D"/>
     <w:pPr>
       <w:keepNext/>
       <w:keepLines/>
@@ -791,7 +769,7 @@
     <w:basedOn w:val="a0"/>
     <w:link w:val="1"/>
     <w:uiPriority w:val="9"/>
-    <w:rsid w:val="008312A7"/>
+    <w:rsid w:val="0073583D"/>
     <w:rPr>
       <w:rFonts w:asciiTheme="majorHAnsi" w:eastAsiaTheme="majorEastAsia" w:hAnsiTheme="majorHAnsi" w:cstheme="majorBidi"/>
       <w:color w:val="0F4761" w:themeColor="accent1" w:themeShade="BF"/>
@@ -805,7 +783,7 @@
     <w:link w:val="2"/>
     <w:uiPriority w:val="9"/>
     <w:semiHidden/>
-    <w:rsid w:val="008312A7"/>
+    <w:rsid w:val="0073583D"/>
     <w:rPr>
       <w:rFonts w:asciiTheme="majorHAnsi" w:eastAsiaTheme="majorEastAsia" w:hAnsiTheme="majorHAnsi" w:cstheme="majorBidi"/>
       <w:color w:val="0F4761" w:themeColor="accent1" w:themeShade="BF"/>
@@ -819,7 +797,7 @@
     <w:link w:val="3"/>
     <w:uiPriority w:val="9"/>
     <w:semiHidden/>
-    <w:rsid w:val="008312A7"/>
+    <w:rsid w:val="0073583D"/>
     <w:rPr>
       <w:rFonts w:asciiTheme="minorHAnsi" w:eastAsiaTheme="majorEastAsia" w:hAnsiTheme="minorHAnsi" w:cstheme="majorBidi"/>
       <w:color w:val="0F4761" w:themeColor="accent1" w:themeShade="BF"/>
@@ -831,7 +809,7 @@
     <w:link w:val="4"/>
     <w:uiPriority w:val="9"/>
     <w:semiHidden/>
-    <w:rsid w:val="008312A7"/>
+    <w:rsid w:val="0073583D"/>
     <w:rPr>
       <w:rFonts w:asciiTheme="minorHAnsi" w:eastAsiaTheme="majorEastAsia" w:hAnsiTheme="minorHAnsi" w:cstheme="majorBidi"/>
       <w:i/>
@@ -845,7 +823,7 @@
     <w:link w:val="5"/>
     <w:uiPriority w:val="9"/>
     <w:semiHidden/>
-    <w:rsid w:val="008312A7"/>
+    <w:rsid w:val="0073583D"/>
     <w:rPr>
       <w:rFonts w:asciiTheme="minorHAnsi" w:eastAsiaTheme="majorEastAsia" w:hAnsiTheme="minorHAnsi" w:cstheme="majorBidi"/>
       <w:color w:val="0F4761" w:themeColor="accent1" w:themeShade="BF"/>
@@ -857,7 +835,7 @@
     <w:link w:val="6"/>
     <w:uiPriority w:val="9"/>
     <w:semiHidden/>
-    <w:rsid w:val="008312A7"/>
+    <w:rsid w:val="0073583D"/>
     <w:rPr>
       <w:rFonts w:asciiTheme="minorHAnsi" w:eastAsiaTheme="majorEastAsia" w:hAnsiTheme="minorHAnsi" w:cstheme="majorBidi"/>
       <w:i/>
@@ -871,7 +849,7 @@
     <w:link w:val="7"/>
     <w:uiPriority w:val="9"/>
     <w:semiHidden/>
-    <w:rsid w:val="008312A7"/>
+    <w:rsid w:val="0073583D"/>
     <w:rPr>
       <w:rFonts w:asciiTheme="minorHAnsi" w:eastAsiaTheme="majorEastAsia" w:hAnsiTheme="minorHAnsi" w:cstheme="majorBidi"/>
       <w:color w:val="595959" w:themeColor="text1" w:themeTint="A6"/>
@@ -883,7 +861,7 @@
     <w:link w:val="8"/>
     <w:uiPriority w:val="9"/>
     <w:semiHidden/>
-    <w:rsid w:val="008312A7"/>
+    <w:rsid w:val="0073583D"/>
     <w:rPr>
       <w:rFonts w:asciiTheme="minorHAnsi" w:eastAsiaTheme="majorEastAsia" w:hAnsiTheme="minorHAnsi" w:cstheme="majorBidi"/>
       <w:i/>
@@ -897,7 +875,7 @@
     <w:link w:val="9"/>
     <w:uiPriority w:val="9"/>
     <w:semiHidden/>
-    <w:rsid w:val="008312A7"/>
+    <w:rsid w:val="0073583D"/>
     <w:rPr>
       <w:rFonts w:asciiTheme="minorHAnsi" w:eastAsiaTheme="majorEastAsia" w:hAnsiTheme="minorHAnsi" w:cstheme="majorBidi"/>
       <w:color w:val="272727" w:themeColor="text1" w:themeTint="D8"/>
@@ -910,7 +888,7 @@
     <w:link w:val="Char"/>
     <w:uiPriority w:val="10"/>
     <w:qFormat/>
-    <w:rsid w:val="008312A7"/>
+    <w:rsid w:val="0073583D"/>
     <w:pPr>
       <w:spacing w:after="80" w:line="240" w:lineRule="auto"/>
       <w:contextualSpacing/>
@@ -928,7 +906,7 @@
     <w:basedOn w:val="a0"/>
     <w:link w:val="a3"/>
     <w:uiPriority w:val="10"/>
-    <w:rsid w:val="008312A7"/>
+    <w:rsid w:val="0073583D"/>
     <w:rPr>
       <w:rFonts w:asciiTheme="majorHAnsi" w:eastAsiaTheme="majorEastAsia" w:hAnsiTheme="majorHAnsi" w:cstheme="majorBidi"/>
       <w:spacing w:val="-10"/>
@@ -944,7 +922,7 @@
     <w:link w:val="Char0"/>
     <w:uiPriority w:val="11"/>
     <w:qFormat/>
-    <w:rsid w:val="008312A7"/>
+    <w:rsid w:val="0073583D"/>
     <w:pPr>
       <w:numPr>
         <w:ilvl w:val="1"/>
@@ -961,7 +939,7 @@
     <w:basedOn w:val="a0"/>
     <w:link w:val="a4"/>
     <w:uiPriority w:val="11"/>
-    <w:rsid w:val="008312A7"/>
+    <w:rsid w:val="0073583D"/>
     <w:rPr>
       <w:rFonts w:asciiTheme="minorHAnsi" w:eastAsiaTheme="majorEastAsia" w:hAnsiTheme="minorHAnsi" w:cstheme="majorBidi"/>
       <w:color w:val="595959" w:themeColor="text1" w:themeTint="A6"/>
@@ -975,7 +953,7 @@
     <w:link w:val="Char1"/>
     <w:uiPriority w:val="29"/>
     <w:qFormat/>
-    <w:rsid w:val="008312A7"/>
+    <w:rsid w:val="0073583D"/>
     <w:pPr>
       <w:spacing w:before="160"/>
       <w:jc w:val="center"/>
@@ -991,7 +969,7 @@
     <w:basedOn w:val="a0"/>
     <w:link w:val="a5"/>
     <w:uiPriority w:val="29"/>
-    <w:rsid w:val="008312A7"/>
+    <w:rsid w:val="0073583D"/>
     <w:rPr>
       <w:i/>
       <w:iCs/>
@@ -1003,7 +981,7 @@
     <w:basedOn w:val="a"/>
     <w:uiPriority w:val="34"/>
     <w:qFormat/>
-    <w:rsid w:val="008312A7"/>
+    <w:rsid w:val="0073583D"/>
     <w:pPr>
       <w:ind w:left="720"/>
       <w:contextualSpacing/>
@@ -1014,7 +992,7 @@
     <w:basedOn w:val="a0"/>
     <w:uiPriority w:val="21"/>
     <w:qFormat/>
-    <w:rsid w:val="008312A7"/>
+    <w:rsid w:val="0073583D"/>
     <w:rPr>
       <w:i/>
       <w:iCs/>
@@ -1028,7 +1006,7 @@
     <w:link w:val="Char2"/>
     <w:uiPriority w:val="30"/>
     <w:qFormat/>
-    <w:rsid w:val="008312A7"/>
+    <w:rsid w:val="0073583D"/>
     <w:pPr>
       <w:pBdr>
         <w:top w:val="single" w:sz="4" w:space="10" w:color="0F4761" w:themeColor="accent1" w:themeShade="BF"/>
@@ -1049,7 +1027,7 @@
     <w:basedOn w:val="a0"/>
     <w:link w:val="a8"/>
     <w:uiPriority w:val="30"/>
-    <w:rsid w:val="008312A7"/>
+    <w:rsid w:val="0073583D"/>
     <w:rPr>
       <w:i/>
       <w:iCs/>
@@ -1061,7 +1039,7 @@
     <w:basedOn w:val="a0"/>
     <w:uiPriority w:val="32"/>
     <w:qFormat/>
-    <w:rsid w:val="008312A7"/>
+    <w:rsid w:val="0073583D"/>
     <w:rPr>
       <w:b/>
       <w:bCs/>

</xml_diff>

<commit_message>
fix(pdf2rtf): resolve layout-derived line spacing in Word DOM reference IR
</commit_message>
<xml_diff>
--- a/experimental/pdf2rtf/real_word_holdout/word_academic_paper.docx
+++ b/experimental/pdf2rtf/real_word_holdout/word_academic_paper.docx
@@ -547,7 +547,7 @@
     <w:link w:val="1Char"/>
     <w:uiPriority w:val="9"/>
     <w:qFormat/>
-    <w:rsid w:val="0073583D"/>
+    <w:rsid w:val="002174F0"/>
     <w:pPr>
       <w:keepNext/>
       <w:keepLines/>
@@ -570,7 +570,7 @@
     <w:semiHidden/>
     <w:unhideWhenUsed/>
     <w:qFormat/>
-    <w:rsid w:val="0073583D"/>
+    <w:rsid w:val="002174F0"/>
     <w:pPr>
       <w:keepNext/>
       <w:keepLines/>
@@ -593,7 +593,7 @@
     <w:semiHidden/>
     <w:unhideWhenUsed/>
     <w:qFormat/>
-    <w:rsid w:val="0073583D"/>
+    <w:rsid w:val="002174F0"/>
     <w:pPr>
       <w:keepNext/>
       <w:keepLines/>
@@ -614,7 +614,7 @@
     <w:semiHidden/>
     <w:unhideWhenUsed/>
     <w:qFormat/>
-    <w:rsid w:val="0073583D"/>
+    <w:rsid w:val="002174F0"/>
     <w:pPr>
       <w:keepNext/>
       <w:keepLines/>
@@ -637,7 +637,7 @@
     <w:semiHidden/>
     <w:unhideWhenUsed/>
     <w:qFormat/>
-    <w:rsid w:val="0073583D"/>
+    <w:rsid w:val="002174F0"/>
     <w:pPr>
       <w:keepNext/>
       <w:keepLines/>
@@ -658,7 +658,7 @@
     <w:semiHidden/>
     <w:unhideWhenUsed/>
     <w:qFormat/>
-    <w:rsid w:val="0073583D"/>
+    <w:rsid w:val="002174F0"/>
     <w:pPr>
       <w:keepNext/>
       <w:keepLines/>
@@ -681,7 +681,7 @@
     <w:semiHidden/>
     <w:unhideWhenUsed/>
     <w:qFormat/>
-    <w:rsid w:val="0073583D"/>
+    <w:rsid w:val="002174F0"/>
     <w:pPr>
       <w:keepNext/>
       <w:keepLines/>
@@ -702,7 +702,7 @@
     <w:semiHidden/>
     <w:unhideWhenUsed/>
     <w:qFormat/>
-    <w:rsid w:val="0073583D"/>
+    <w:rsid w:val="002174F0"/>
     <w:pPr>
       <w:keepNext/>
       <w:keepLines/>
@@ -725,7 +725,7 @@
     <w:semiHidden/>
     <w:unhideWhenUsed/>
     <w:qFormat/>
-    <w:rsid w:val="0073583D"/>
+    <w:rsid w:val="002174F0"/>
     <w:pPr>
       <w:keepNext/>
       <w:keepLines/>
@@ -769,7 +769,7 @@
     <w:basedOn w:val="a0"/>
     <w:link w:val="1"/>
     <w:uiPriority w:val="9"/>
-    <w:rsid w:val="0073583D"/>
+    <w:rsid w:val="002174F0"/>
     <w:rPr>
       <w:rFonts w:asciiTheme="majorHAnsi" w:eastAsiaTheme="majorEastAsia" w:hAnsiTheme="majorHAnsi" w:cstheme="majorBidi"/>
       <w:color w:val="0F4761" w:themeColor="accent1" w:themeShade="BF"/>
@@ -783,7 +783,7 @@
     <w:link w:val="2"/>
     <w:uiPriority w:val="9"/>
     <w:semiHidden/>
-    <w:rsid w:val="0073583D"/>
+    <w:rsid w:val="002174F0"/>
     <w:rPr>
       <w:rFonts w:asciiTheme="majorHAnsi" w:eastAsiaTheme="majorEastAsia" w:hAnsiTheme="majorHAnsi" w:cstheme="majorBidi"/>
       <w:color w:val="0F4761" w:themeColor="accent1" w:themeShade="BF"/>
@@ -797,7 +797,7 @@
     <w:link w:val="3"/>
     <w:uiPriority w:val="9"/>
     <w:semiHidden/>
-    <w:rsid w:val="0073583D"/>
+    <w:rsid w:val="002174F0"/>
     <w:rPr>
       <w:rFonts w:asciiTheme="minorHAnsi" w:eastAsiaTheme="majorEastAsia" w:hAnsiTheme="minorHAnsi" w:cstheme="majorBidi"/>
       <w:color w:val="0F4761" w:themeColor="accent1" w:themeShade="BF"/>
@@ -809,7 +809,7 @@
     <w:link w:val="4"/>
     <w:uiPriority w:val="9"/>
     <w:semiHidden/>
-    <w:rsid w:val="0073583D"/>
+    <w:rsid w:val="002174F0"/>
     <w:rPr>
       <w:rFonts w:asciiTheme="minorHAnsi" w:eastAsiaTheme="majorEastAsia" w:hAnsiTheme="minorHAnsi" w:cstheme="majorBidi"/>
       <w:i/>
@@ -823,7 +823,7 @@
     <w:link w:val="5"/>
     <w:uiPriority w:val="9"/>
     <w:semiHidden/>
-    <w:rsid w:val="0073583D"/>
+    <w:rsid w:val="002174F0"/>
     <w:rPr>
       <w:rFonts w:asciiTheme="minorHAnsi" w:eastAsiaTheme="majorEastAsia" w:hAnsiTheme="minorHAnsi" w:cstheme="majorBidi"/>
       <w:color w:val="0F4761" w:themeColor="accent1" w:themeShade="BF"/>
@@ -835,7 +835,7 @@
     <w:link w:val="6"/>
     <w:uiPriority w:val="9"/>
     <w:semiHidden/>
-    <w:rsid w:val="0073583D"/>
+    <w:rsid w:val="002174F0"/>
     <w:rPr>
       <w:rFonts w:asciiTheme="minorHAnsi" w:eastAsiaTheme="majorEastAsia" w:hAnsiTheme="minorHAnsi" w:cstheme="majorBidi"/>
       <w:i/>
@@ -849,7 +849,7 @@
     <w:link w:val="7"/>
     <w:uiPriority w:val="9"/>
     <w:semiHidden/>
-    <w:rsid w:val="0073583D"/>
+    <w:rsid w:val="002174F0"/>
     <w:rPr>
       <w:rFonts w:asciiTheme="minorHAnsi" w:eastAsiaTheme="majorEastAsia" w:hAnsiTheme="minorHAnsi" w:cstheme="majorBidi"/>
       <w:color w:val="595959" w:themeColor="text1" w:themeTint="A6"/>
@@ -861,7 +861,7 @@
     <w:link w:val="8"/>
     <w:uiPriority w:val="9"/>
     <w:semiHidden/>
-    <w:rsid w:val="0073583D"/>
+    <w:rsid w:val="002174F0"/>
     <w:rPr>
       <w:rFonts w:asciiTheme="minorHAnsi" w:eastAsiaTheme="majorEastAsia" w:hAnsiTheme="minorHAnsi" w:cstheme="majorBidi"/>
       <w:i/>
@@ -875,7 +875,7 @@
     <w:link w:val="9"/>
     <w:uiPriority w:val="9"/>
     <w:semiHidden/>
-    <w:rsid w:val="0073583D"/>
+    <w:rsid w:val="002174F0"/>
     <w:rPr>
       <w:rFonts w:asciiTheme="minorHAnsi" w:eastAsiaTheme="majorEastAsia" w:hAnsiTheme="minorHAnsi" w:cstheme="majorBidi"/>
       <w:color w:val="272727" w:themeColor="text1" w:themeTint="D8"/>
@@ -888,7 +888,7 @@
     <w:link w:val="Char"/>
     <w:uiPriority w:val="10"/>
     <w:qFormat/>
-    <w:rsid w:val="0073583D"/>
+    <w:rsid w:val="002174F0"/>
     <w:pPr>
       <w:spacing w:after="80" w:line="240" w:lineRule="auto"/>
       <w:contextualSpacing/>
@@ -906,7 +906,7 @@
     <w:basedOn w:val="a0"/>
     <w:link w:val="a3"/>
     <w:uiPriority w:val="10"/>
-    <w:rsid w:val="0073583D"/>
+    <w:rsid w:val="002174F0"/>
     <w:rPr>
       <w:rFonts w:asciiTheme="majorHAnsi" w:eastAsiaTheme="majorEastAsia" w:hAnsiTheme="majorHAnsi" w:cstheme="majorBidi"/>
       <w:spacing w:val="-10"/>
@@ -922,7 +922,7 @@
     <w:link w:val="Char0"/>
     <w:uiPriority w:val="11"/>
     <w:qFormat/>
-    <w:rsid w:val="0073583D"/>
+    <w:rsid w:val="002174F0"/>
     <w:pPr>
       <w:numPr>
         <w:ilvl w:val="1"/>
@@ -939,7 +939,7 @@
     <w:basedOn w:val="a0"/>
     <w:link w:val="a4"/>
     <w:uiPriority w:val="11"/>
-    <w:rsid w:val="0073583D"/>
+    <w:rsid w:val="002174F0"/>
     <w:rPr>
       <w:rFonts w:asciiTheme="minorHAnsi" w:eastAsiaTheme="majorEastAsia" w:hAnsiTheme="minorHAnsi" w:cstheme="majorBidi"/>
       <w:color w:val="595959" w:themeColor="text1" w:themeTint="A6"/>
@@ -953,7 +953,7 @@
     <w:link w:val="Char1"/>
     <w:uiPriority w:val="29"/>
     <w:qFormat/>
-    <w:rsid w:val="0073583D"/>
+    <w:rsid w:val="002174F0"/>
     <w:pPr>
       <w:spacing w:before="160"/>
       <w:jc w:val="center"/>
@@ -969,7 +969,7 @@
     <w:basedOn w:val="a0"/>
     <w:link w:val="a5"/>
     <w:uiPriority w:val="29"/>
-    <w:rsid w:val="0073583D"/>
+    <w:rsid w:val="002174F0"/>
     <w:rPr>
       <w:i/>
       <w:iCs/>
@@ -981,7 +981,7 @@
     <w:basedOn w:val="a"/>
     <w:uiPriority w:val="34"/>
     <w:qFormat/>
-    <w:rsid w:val="0073583D"/>
+    <w:rsid w:val="002174F0"/>
     <w:pPr>
       <w:ind w:left="720"/>
       <w:contextualSpacing/>
@@ -992,7 +992,7 @@
     <w:basedOn w:val="a0"/>
     <w:uiPriority w:val="21"/>
     <w:qFormat/>
-    <w:rsid w:val="0073583D"/>
+    <w:rsid w:val="002174F0"/>
     <w:rPr>
       <w:i/>
       <w:iCs/>
@@ -1006,7 +1006,7 @@
     <w:link w:val="Char2"/>
     <w:uiPriority w:val="30"/>
     <w:qFormat/>
-    <w:rsid w:val="0073583D"/>
+    <w:rsid w:val="002174F0"/>
     <w:pPr>
       <w:pBdr>
         <w:top w:val="single" w:sz="4" w:space="10" w:color="0F4761" w:themeColor="accent1" w:themeShade="BF"/>
@@ -1027,7 +1027,7 @@
     <w:basedOn w:val="a0"/>
     <w:link w:val="a8"/>
     <w:uiPriority w:val="30"/>
-    <w:rsid w:val="0073583D"/>
+    <w:rsid w:val="002174F0"/>
     <w:rPr>
       <w:i/>
       <w:iCs/>
@@ -1039,7 +1039,7 @@
     <w:basedOn w:val="a0"/>
     <w:uiPriority w:val="32"/>
     <w:qFormat/>
-    <w:rsid w:val="0073583D"/>
+    <w:rsid w:val="002174F0"/>
     <w:rPr>
       <w:b/>
       <w:bCs/>

</xml_diff>

<commit_message>
feat(pdf2rtf): expand real Word holdout to N=12, add 20-seed statistical evaluation and baseline/ablation suite
</commit_message>
<xml_diff>
--- a/experimental/pdf2rtf/real_word_holdout/word_academic_paper.docx
+++ b/experimental/pdf2rtf/real_word_holdout/word_academic_paper.docx
@@ -547,7 +547,7 @@
     <w:link w:val="1Char"/>
     <w:uiPriority w:val="9"/>
     <w:qFormat/>
-    <w:rsid w:val="002174F0"/>
+    <w:rsid w:val="007D3FD1"/>
     <w:pPr>
       <w:keepNext/>
       <w:keepLines/>
@@ -570,7 +570,7 @@
     <w:semiHidden/>
     <w:unhideWhenUsed/>
     <w:qFormat/>
-    <w:rsid w:val="002174F0"/>
+    <w:rsid w:val="007D3FD1"/>
     <w:pPr>
       <w:keepNext/>
       <w:keepLines/>
@@ -593,7 +593,7 @@
     <w:semiHidden/>
     <w:unhideWhenUsed/>
     <w:qFormat/>
-    <w:rsid w:val="002174F0"/>
+    <w:rsid w:val="007D3FD1"/>
     <w:pPr>
       <w:keepNext/>
       <w:keepLines/>
@@ -614,7 +614,7 @@
     <w:semiHidden/>
     <w:unhideWhenUsed/>
     <w:qFormat/>
-    <w:rsid w:val="002174F0"/>
+    <w:rsid w:val="007D3FD1"/>
     <w:pPr>
       <w:keepNext/>
       <w:keepLines/>
@@ -637,7 +637,7 @@
     <w:semiHidden/>
     <w:unhideWhenUsed/>
     <w:qFormat/>
-    <w:rsid w:val="002174F0"/>
+    <w:rsid w:val="007D3FD1"/>
     <w:pPr>
       <w:keepNext/>
       <w:keepLines/>
@@ -658,7 +658,7 @@
     <w:semiHidden/>
     <w:unhideWhenUsed/>
     <w:qFormat/>
-    <w:rsid w:val="002174F0"/>
+    <w:rsid w:val="007D3FD1"/>
     <w:pPr>
       <w:keepNext/>
       <w:keepLines/>
@@ -681,7 +681,7 @@
     <w:semiHidden/>
     <w:unhideWhenUsed/>
     <w:qFormat/>
-    <w:rsid w:val="002174F0"/>
+    <w:rsid w:val="007D3FD1"/>
     <w:pPr>
       <w:keepNext/>
       <w:keepLines/>
@@ -702,7 +702,7 @@
     <w:semiHidden/>
     <w:unhideWhenUsed/>
     <w:qFormat/>
-    <w:rsid w:val="002174F0"/>
+    <w:rsid w:val="007D3FD1"/>
     <w:pPr>
       <w:keepNext/>
       <w:keepLines/>
@@ -725,7 +725,7 @@
     <w:semiHidden/>
     <w:unhideWhenUsed/>
     <w:qFormat/>
-    <w:rsid w:val="002174F0"/>
+    <w:rsid w:val="007D3FD1"/>
     <w:pPr>
       <w:keepNext/>
       <w:keepLines/>
@@ -769,7 +769,7 @@
     <w:basedOn w:val="a0"/>
     <w:link w:val="1"/>
     <w:uiPriority w:val="9"/>
-    <w:rsid w:val="002174F0"/>
+    <w:rsid w:val="007D3FD1"/>
     <w:rPr>
       <w:rFonts w:asciiTheme="majorHAnsi" w:eastAsiaTheme="majorEastAsia" w:hAnsiTheme="majorHAnsi" w:cstheme="majorBidi"/>
       <w:color w:val="0F4761" w:themeColor="accent1" w:themeShade="BF"/>
@@ -783,7 +783,7 @@
     <w:link w:val="2"/>
     <w:uiPriority w:val="9"/>
     <w:semiHidden/>
-    <w:rsid w:val="002174F0"/>
+    <w:rsid w:val="007D3FD1"/>
     <w:rPr>
       <w:rFonts w:asciiTheme="majorHAnsi" w:eastAsiaTheme="majorEastAsia" w:hAnsiTheme="majorHAnsi" w:cstheme="majorBidi"/>
       <w:color w:val="0F4761" w:themeColor="accent1" w:themeShade="BF"/>
@@ -797,7 +797,7 @@
     <w:link w:val="3"/>
     <w:uiPriority w:val="9"/>
     <w:semiHidden/>
-    <w:rsid w:val="002174F0"/>
+    <w:rsid w:val="007D3FD1"/>
     <w:rPr>
       <w:rFonts w:asciiTheme="minorHAnsi" w:eastAsiaTheme="majorEastAsia" w:hAnsiTheme="minorHAnsi" w:cstheme="majorBidi"/>
       <w:color w:val="0F4761" w:themeColor="accent1" w:themeShade="BF"/>
@@ -809,7 +809,7 @@
     <w:link w:val="4"/>
     <w:uiPriority w:val="9"/>
     <w:semiHidden/>
-    <w:rsid w:val="002174F0"/>
+    <w:rsid w:val="007D3FD1"/>
     <w:rPr>
       <w:rFonts w:asciiTheme="minorHAnsi" w:eastAsiaTheme="majorEastAsia" w:hAnsiTheme="minorHAnsi" w:cstheme="majorBidi"/>
       <w:i/>
@@ -823,7 +823,7 @@
     <w:link w:val="5"/>
     <w:uiPriority w:val="9"/>
     <w:semiHidden/>
-    <w:rsid w:val="002174F0"/>
+    <w:rsid w:val="007D3FD1"/>
     <w:rPr>
       <w:rFonts w:asciiTheme="minorHAnsi" w:eastAsiaTheme="majorEastAsia" w:hAnsiTheme="minorHAnsi" w:cstheme="majorBidi"/>
       <w:color w:val="0F4761" w:themeColor="accent1" w:themeShade="BF"/>
@@ -835,7 +835,7 @@
     <w:link w:val="6"/>
     <w:uiPriority w:val="9"/>
     <w:semiHidden/>
-    <w:rsid w:val="002174F0"/>
+    <w:rsid w:val="007D3FD1"/>
     <w:rPr>
       <w:rFonts w:asciiTheme="minorHAnsi" w:eastAsiaTheme="majorEastAsia" w:hAnsiTheme="minorHAnsi" w:cstheme="majorBidi"/>
       <w:i/>
@@ -849,7 +849,7 @@
     <w:link w:val="7"/>
     <w:uiPriority w:val="9"/>
     <w:semiHidden/>
-    <w:rsid w:val="002174F0"/>
+    <w:rsid w:val="007D3FD1"/>
     <w:rPr>
       <w:rFonts w:asciiTheme="minorHAnsi" w:eastAsiaTheme="majorEastAsia" w:hAnsiTheme="minorHAnsi" w:cstheme="majorBidi"/>
       <w:color w:val="595959" w:themeColor="text1" w:themeTint="A6"/>
@@ -861,7 +861,7 @@
     <w:link w:val="8"/>
     <w:uiPriority w:val="9"/>
     <w:semiHidden/>
-    <w:rsid w:val="002174F0"/>
+    <w:rsid w:val="007D3FD1"/>
     <w:rPr>
       <w:rFonts w:asciiTheme="minorHAnsi" w:eastAsiaTheme="majorEastAsia" w:hAnsiTheme="minorHAnsi" w:cstheme="majorBidi"/>
       <w:i/>
@@ -875,7 +875,7 @@
     <w:link w:val="9"/>
     <w:uiPriority w:val="9"/>
     <w:semiHidden/>
-    <w:rsid w:val="002174F0"/>
+    <w:rsid w:val="007D3FD1"/>
     <w:rPr>
       <w:rFonts w:asciiTheme="minorHAnsi" w:eastAsiaTheme="majorEastAsia" w:hAnsiTheme="minorHAnsi" w:cstheme="majorBidi"/>
       <w:color w:val="272727" w:themeColor="text1" w:themeTint="D8"/>
@@ -888,7 +888,7 @@
     <w:link w:val="Char"/>
     <w:uiPriority w:val="10"/>
     <w:qFormat/>
-    <w:rsid w:val="002174F0"/>
+    <w:rsid w:val="007D3FD1"/>
     <w:pPr>
       <w:spacing w:after="80" w:line="240" w:lineRule="auto"/>
       <w:contextualSpacing/>
@@ -906,7 +906,7 @@
     <w:basedOn w:val="a0"/>
     <w:link w:val="a3"/>
     <w:uiPriority w:val="10"/>
-    <w:rsid w:val="002174F0"/>
+    <w:rsid w:val="007D3FD1"/>
     <w:rPr>
       <w:rFonts w:asciiTheme="majorHAnsi" w:eastAsiaTheme="majorEastAsia" w:hAnsiTheme="majorHAnsi" w:cstheme="majorBidi"/>
       <w:spacing w:val="-10"/>
@@ -922,7 +922,7 @@
     <w:link w:val="Char0"/>
     <w:uiPriority w:val="11"/>
     <w:qFormat/>
-    <w:rsid w:val="002174F0"/>
+    <w:rsid w:val="007D3FD1"/>
     <w:pPr>
       <w:numPr>
         <w:ilvl w:val="1"/>
@@ -939,7 +939,7 @@
     <w:basedOn w:val="a0"/>
     <w:link w:val="a4"/>
     <w:uiPriority w:val="11"/>
-    <w:rsid w:val="002174F0"/>
+    <w:rsid w:val="007D3FD1"/>
     <w:rPr>
       <w:rFonts w:asciiTheme="minorHAnsi" w:eastAsiaTheme="majorEastAsia" w:hAnsiTheme="minorHAnsi" w:cstheme="majorBidi"/>
       <w:color w:val="595959" w:themeColor="text1" w:themeTint="A6"/>
@@ -953,7 +953,7 @@
     <w:link w:val="Char1"/>
     <w:uiPriority w:val="29"/>
     <w:qFormat/>
-    <w:rsid w:val="002174F0"/>
+    <w:rsid w:val="007D3FD1"/>
     <w:pPr>
       <w:spacing w:before="160"/>
       <w:jc w:val="center"/>
@@ -969,7 +969,7 @@
     <w:basedOn w:val="a0"/>
     <w:link w:val="a5"/>
     <w:uiPriority w:val="29"/>
-    <w:rsid w:val="002174F0"/>
+    <w:rsid w:val="007D3FD1"/>
     <w:rPr>
       <w:i/>
       <w:iCs/>
@@ -981,7 +981,7 @@
     <w:basedOn w:val="a"/>
     <w:uiPriority w:val="34"/>
     <w:qFormat/>
-    <w:rsid w:val="002174F0"/>
+    <w:rsid w:val="007D3FD1"/>
     <w:pPr>
       <w:ind w:left="720"/>
       <w:contextualSpacing/>
@@ -992,7 +992,7 @@
     <w:basedOn w:val="a0"/>
     <w:uiPriority w:val="21"/>
     <w:qFormat/>
-    <w:rsid w:val="002174F0"/>
+    <w:rsid w:val="007D3FD1"/>
     <w:rPr>
       <w:i/>
       <w:iCs/>
@@ -1006,7 +1006,7 @@
     <w:link w:val="Char2"/>
     <w:uiPriority w:val="30"/>
     <w:qFormat/>
-    <w:rsid w:val="002174F0"/>
+    <w:rsid w:val="007D3FD1"/>
     <w:pPr>
       <w:pBdr>
         <w:top w:val="single" w:sz="4" w:space="10" w:color="0F4761" w:themeColor="accent1" w:themeShade="BF"/>
@@ -1027,7 +1027,7 @@
     <w:basedOn w:val="a0"/>
     <w:link w:val="a8"/>
     <w:uiPriority w:val="30"/>
-    <w:rsid w:val="002174F0"/>
+    <w:rsid w:val="007D3FD1"/>
     <w:rPr>
       <w:i/>
       <w:iCs/>
@@ -1039,7 +1039,7 @@
     <w:basedOn w:val="a0"/>
     <w:uiPriority w:val="32"/>
     <w:qFormat/>
-    <w:rsid w:val="002174F0"/>
+    <w:rsid w:val="007D3FD1"/>
     <w:rPr>
       <w:b/>
       <w:bCs/>

</xml_diff>